<commit_message>
fix: update Ashutosh number to 9117696512, clean footer, resilient lead storage & shared S logo
</commit_message>
<xml_diff>
--- a/Soft_Tech_Solution_Architecture_Documentation.docx
+++ b/Soft_Tech_Solution_Architecture_Documentation.docx
@@ -487,7 +487,7 @@
                 <w:sz w:val="20"/>
                 <w:szCs w:val="20"/>
               </w:rPr>
-              <w:t xml:space="preserve">Aashutosh Kumar (Mobile: +91 9876543753)</w:t>
+              <w:t xml:space="preserve">Aashutosh Kumar (Mobile: +91 9117696512)</w:t>
             </w:r>
           </w:p>
         </w:tc>
@@ -783,7 +783,7 @@
           <w:sz w:val="22"/>
           <w:szCs w:val="22"/>
         </w:rPr>
-        <w:t xml:space="preserve">Founder, Soft Tech Solution | Mobile/WhatsApp: +91 9876543753 | Image: Blue Coat Portrait</w:t>
+        <w:t xml:space="preserve">Founder, Soft Tech Solution | Mobile/WhatsApp: +91 9117696512 | Image: Blue Coat Portrait</w:t>
       </w:r>
     </w:p>
     <w:p>
@@ -2970,7 +2970,7 @@
           <w:sz w:val="19"/>
           <w:szCs w:val="19"/>
         </w:rPr>
-        <w:t xml:space="preserve">    showToast('Something went wrong. Please call +91 9876543753 or +91 6205570278.', 'error');</w:t>
+        <w:t xml:space="preserve">    showToast('Something went wrong. Please call +91 9117696512 or +91 6205570278.', 'error');</w:t>
       </w:r>
     </w:p>
     <w:p>

</xml_diff>

<commit_message>
feat: update co-founder Ankitosh Kumar portrait with real photo
</commit_message>
<xml_diff>
--- a/Soft_Tech_Solution_Architecture_Documentation.docx
+++ b/Soft_Tech_Solution_Architecture_Documentation.docx
@@ -807,7 +807,7 @@
           <w:sz w:val="22"/>
           <w:szCs w:val="22"/>
         </w:rPr>
-        <w:t xml:space="preserve">Co-Founder, Soft Tech Solution | Mobile/WhatsApp: +91 6205570278 | Image: White Shirt Portrait</w:t>
+        <w:t xml:space="preserve">Co-Founder, Soft Tech Solution | Mobile/WhatsApp: +91 6205570278 | Image: Blue Blazer Portrait</w:t>
       </w:r>
     </w:p>
     <w:p>
@@ -2120,7 +2120,7 @@
           <w:sz w:val="19"/>
           <w:szCs w:val="19"/>
         </w:rPr>
-        <w:t xml:space="preserve">│   ├── ankitosh-kumar-cofounder.jpeg # Ankitosh Kumar portrait (white shirt)</w:t>
+        <w:t xml:space="preserve">│   ├── ankitosh-kumar-cofounder.jpeg # Ankitosh Kumar portrait (blue blazer)</w:t>
       </w:r>
     </w:p>
     <w:p>

</xml_diff>

<commit_message>
feat: update co-founder Ankitosh Kumar portrait to new blue suit photo
</commit_message>
<xml_diff>
--- a/Soft_Tech_Solution_Architecture_Documentation.docx
+++ b/Soft_Tech_Solution_Architecture_Documentation.docx
@@ -807,7 +807,7 @@
           <w:sz w:val="22"/>
           <w:szCs w:val="22"/>
         </w:rPr>
-        <w:t xml:space="preserve">Co-Founder, Soft Tech Solution | Mobile/WhatsApp: +91 6205570278 | Image: Blue Blazer Portrait</w:t>
+        <w:t xml:space="preserve">Co-Founder, Soft Tech Solution | Mobile/WhatsApp: +91 6205570278 | Image: Blue Blazer Suit Portrait</w:t>
       </w:r>
     </w:p>
     <w:p>
@@ -2120,7 +2120,7 @@
           <w:sz w:val="19"/>
           <w:szCs w:val="19"/>
         </w:rPr>
-        <w:t xml:space="preserve">│   ├── ankitosh-kumar-cofounder.jpeg # Ankitosh Kumar portrait (blue blazer)</w:t>
+        <w:t xml:space="preserve">│   ├── ankitosh-kumar-cofounder.jpeg # Ankitosh Kumar portrait (blue blazer suit)</w:t>
       </w:r>
     </w:p>
     <w:p>

</xml_diff>